<commit_message>
Add GitHub Link to the report
</commit_message>
<xml_diff>
--- a/County Level Income and Health Data Workflow.docx
+++ b/County Level Income and Health Data Workflow.docx
@@ -900,6 +900,12 @@
       </w:pPr>
       <w:r>
         <w:t>The project follows principles of reproducible computational research (Sandve et al., 2013; Danchev, 2022).</w:t>
+      </w:r>
+      <w:r>
+        <w:t xml:space="preserve"> </w:t>
+      </w:r>
+      <w:r>
+        <w:t>The complete codebase and data workflow are available at the project repository: https://github.com/zhiruiwang/ai-programming-foundations-project</w:t>
       </w:r>
     </w:p>
     <w:p>

</xml_diff>